<commit_message>
Make physician training brochure-first and add Prof. Liang 1:1 script.
HCP calls now walk the leave-behind in page order (CHR graph, 84.3% ever-response, JAK2, EFS, 36-month AE table, PI) with the PI primaries as the spoken translation. Add a consult-style 25-minute script for the HKSH meeting.

Co-authored-by: jackiechow4567-arch <jackiechow4567-arch@users.noreply.github.com>
</commit_message>
<xml_diff>
--- a/industry/pm-reference/physician-product-training.docx
+++ b/industry/pm-reference/physician-product-training.docx
@@ -7,7 +7,7 @@
         <w:pStyle w:val="Heading1"/>
       </w:pPr>
       <w:r>
-        <w:t>BESREMi physician product training (HK) — v2 (meeting-ready)</w:t>
+        <w:t>BESREMi physician product training (HK) — v3 (brochure-first)</w:t>
       </w:r>
       <w:r/>
       <w:r/>
@@ -54,7 +54,7 @@
         <w:t>Revision date:</w:t>
       </w:r>
       <w:r>
-        <w:t xml:space="preserve"> 2026-08-25 (v2)</w:t>
+        <w:t xml:space="preserve"> 2026-08-26 (v3 — brochure-first)</w:t>
         <w:br/>
       </w:r>
       <w:r/>
@@ -62,10 +62,10 @@
         <w:rPr>
           <w:b/>
         </w:rPr>
-        <w:t>Meeting:</w:t>
-      </w:r>
-      <w:r>
-        <w:t xml:space="preserve"> Wednesday 26 Aug 2026 — use </w:t>
+        <w:t>Meeting today:</w:t>
+      </w:r>
+      <w:r>
+        <w:t xml:space="preserve"> (1) Internal cert — </w:t>
       </w:r>
       <w:hyperlink r:id="rId11">
         <w:r>
@@ -77,18 +77,28 @@
         </w:r>
       </w:hyperlink>
       <w:r>
-        <w:t xml:space="preserve"> as the run-of-show.</w:t>
-        <w:br/>
-      </w:r>
-      <w:r/>
+        <w:t xml:space="preserve">. (2) </w:t>
+      </w:r>
       <w:r>
         <w:rPr>
           <w:b/>
         </w:rPr>
-        <w:t>What changed in v2:</w:t>
-      </w:r>
-      <w:r>
-        <w:t xml:space="preserve"> Closed library gaps — year-1 PROUD-PV honesty, trial safety, EFS ≠ OS, AMWG overlay, gated Low-PV, HIDAT/do-not-use certification. Still no ET/MF/pregnancy promo.</w:t>
+        <w:t>Prof. Liang 1:1</w:t>
+      </w:r>
+      <w:r>
+        <w:t xml:space="preserve"> — </w:t>
+      </w:r>
+      <w:hyperlink r:id="rId12">
+        <w:r>
+          <w:rPr>
+            <w:color w:val="0000EE"/>
+            <w:u w:val="single"/>
+          </w:rPr>
+          <w:t>hcp-meeting-script-liang-20260826.md</w:t>
+        </w:r>
+      </w:hyperlink>
+      <w:r>
+        <w:t>.</w:t>
         <w:br/>
       </w:r>
       <w:r/>
@@ -96,28 +106,28 @@
         <w:rPr>
           <w:b/>
         </w:rPr>
-        <w:t>What changed after the full brochure:</w:t>
-      </w:r>
-      <w:r>
-        <w:t xml:space="preserve"> Training now maps the leave-behind’s 5-year CHR graph, </w:t>
+        <w:t>What changed in v3:</w:t>
+      </w:r>
+      <w:r>
+        <w:t xml:space="preserve"> Training spine is the </w:t>
       </w:r>
       <w:r>
         <w:rPr>
           <w:b/>
         </w:rPr>
-        <w:t>84.3% ever-CHR</w:t>
-      </w:r>
-      <w:r>
-        <w:t xml:space="preserve">, JAK2 </w:t>
+        <w:t>physician brochure</w:t>
+      </w:r>
+      <w:r>
+        <w:t xml:space="preserve"> (CHR graph → 84.3% ever-CHR → JAK2 8% vs 44% → EFS KM → 36-month AE table → PI). PI 43.1% / 54.5% are </w:t>
       </w:r>
       <w:r>
         <w:rPr>
           <w:b/>
         </w:rPr>
-        <w:t>8% vs 44%</w:t>
-      </w:r>
-      <w:r>
-        <w:t>, 36-month AE table, and PI page so field does not contradict the handout.</w:t>
+        <w:t>said out loud as the translation</w:t>
+      </w:r>
+      <w:r>
+        <w:t>, not as a competing headline.</w:t>
       </w:r>
       <w:r/>
       <w:r/>
@@ -474,7 +484,7 @@
             <w:tcW w:type="dxa" w:w="4824"/>
           </w:tcPr>
           <w:p>
-            <w:hyperlink r:id="rId12">
+            <w:hyperlink r:id="rId13">
               <w:r>
                 <w:rPr>
                   <w:color w:val="0000EE"/>
@@ -486,7 +496,7 @@
             <w:r>
               <w:t xml:space="preserve"> (this file) · Word: </w:t>
             </w:r>
-            <w:hyperlink r:id="rId13">
+            <w:hyperlink r:id="rId14">
               <w:r>
                 <w:rPr>
                   <w:color w:val="0000EE"/>
@@ -545,7 +555,7 @@
             <w:tcW w:type="dxa" w:w="4824"/>
           </w:tcPr>
           <w:p>
-            <w:hyperlink r:id="rId14">
+            <w:hyperlink r:id="rId15">
               <w:r>
                 <w:rPr>
                   <w:color w:val="0000EE"/>
@@ -573,7 +583,7 @@
             <w:tcW w:type="dxa" w:w="4824"/>
           </w:tcPr>
           <w:p>
-            <w:hyperlink r:id="rId15">
+            <w:hyperlink r:id="rId16">
               <w:r>
                 <w:rPr>
                   <w:color w:val="0000EE"/>
@@ -604,7 +614,7 @@
             <w:tcW w:type="dxa" w:w="4824"/>
           </w:tcPr>
           <w:p>
-            <w:hyperlink r:id="rId16">
+            <w:hyperlink r:id="rId17">
               <w:r>
                 <w:rPr>
                   <w:color w:val="0000EE"/>
@@ -635,7 +645,7 @@
             <w:tcW w:type="dxa" w:w="4824"/>
           </w:tcPr>
           <w:p>
-            <w:hyperlink r:id="rId17">
+            <w:hyperlink r:id="rId18">
               <w:r>
                 <w:rPr>
                   <w:color w:val="0000EE"/>
@@ -654,7 +664,10 @@
           </w:tcPr>
           <w:p>
             <w:r>
-              <w:t>Canva 12-slide deck (v1 visual; use HTML for v2)</w:t>
+              <w:rPr>
+                <w:b/>
+              </w:rPr>
+              <w:t>Prof. Liang 1:1 script (26 Aug)</w:t>
             </w:r>
           </w:p>
         </w:tc>
@@ -663,27 +676,27 @@
             <w:tcW w:type="dxa" w:w="4824"/>
           </w:tcPr>
           <w:p>
-            <w:hyperlink r:id="rId18">
+            <w:hyperlink r:id="rId12">
               <w:r>
                 <w:rPr>
                   <w:color w:val="0000EE"/>
                   <w:u w:val="single"/>
                 </w:rPr>
-                <w:t>Open in Canva</w:t>
+                <w:t>hcp-meeting-script-liang-20260826.md</w:t>
               </w:r>
             </w:hyperlink>
             <w:r>
-              <w:t xml:space="preserve"> (design </w:t>
-            </w:r>
-            <w:r>
-              <w:rPr>
-                <w:rFonts w:ascii="Courier" w:hAnsi="Courier"/>
-              </w:rPr>
-              <w:t>DAHTRbuo6kQ</w:t>
-            </w:r>
-            <w:r>
-              <w:t xml:space="preserve"> )</w:t>
-            </w:r>
+              <w:t xml:space="preserve"> · Word: </w:t>
+            </w:r>
+            <w:hyperlink r:id="rId19">
+              <w:r>
+                <w:rPr>
+                  <w:color w:val="0000EE"/>
+                  <w:u w:val="single"/>
+                </w:rPr>
+                <w:t>hcp-meeting-script-liang-20260826.docx</w:t>
+              </w:r>
+            </w:hyperlink>
           </w:p>
         </w:tc>
       </w:tr>
@@ -739,77 +752,81 @@
         <w:t>Do</w:t>
       </w:r>
       <w:r>
-        <w:t xml:space="preserve"> run disease-first, then </w:t>
+        <w:t xml:space="preserve"> walk the </w:t>
       </w:r>
       <w:r>
         <w:rPr>
           <w:b/>
         </w:rPr>
-        <w:t>say the year-1 miss before the 6-year win</w:t>
-      </w:r>
-      <w:r>
-        <w:t xml:space="preserve">, then safety, then HK PI. If you are </w:t>
+        <w:t>physician brochure in page order</w:t>
+      </w:r>
+      <w:r>
+        <w:t xml:space="preserve"> with every physician who receives it: CHR graph → 84.3% footnote → JAK2 → EFS → safety table → PI. </w:t>
       </w:r>
       <w:r>
         <w:rPr>
           <w:b/>
         </w:rPr>
-        <w:t>handing the full physician brochure</w:t>
-      </w:r>
-      <w:r>
-        <w:t xml:space="preserve"> (EFFICACY / SAFETY / OTHER INFO tabs), walk those pages and use </w:t>
-      </w:r>
-      <w:hyperlink r:id="rId16">
+        <w:t>Do not</w:t>
+      </w:r>
+      <w:r>
+        <w:t xml:space="preserve"> lecture a senior haematologist on WHO 2016. </w:t>
+      </w:r>
+      <w:r>
+        <w:rPr>
+          <w:b/>
+        </w:rPr>
+        <w:t>Do not</w:t>
+      </w:r>
+      <w:r>
+        <w:t xml:space="preserve"> import HIDAT, Pegasys superiority, ET/MF, pregnancy, or the Novartis early-MF PDF.</w:t>
+      </w:r>
+      <w:r/>
+    </w:p>
+    <w:p>
+      <w:r/>
+      <w:r>
+        <w:rPr>
+          <w:b/>
+        </w:rPr>
+        <w:t>HCP 1:1 (including Prof. Liang today):</w:t>
+      </w:r>
+      <w:r>
+        <w:t xml:space="preserve"> use </w:t>
+      </w:r>
+      <w:hyperlink r:id="rId12">
         <w:r>
           <w:rPr>
             <w:color w:val="0000EE"/>
             <w:u w:val="single"/>
           </w:rPr>
-          <w:t>physician-product-training-brochure-map.md</w:t>
+          <w:t>hcp-meeting-script-liang-20260826.md</w:t>
         </w:r>
       </w:hyperlink>
       <w:r>
-        <w:t xml:space="preserve"> as the translation layer. </w:t>
-      </w:r>
+        <w:t xml:space="preserve"> — consult style, ~25 minutes. Internal 60-minute cert still uses the meeting brief.</w:t>
+      </w:r>
+      <w:r/>
+    </w:p>
+    <w:p>
+      <w:r/>
       <w:r>
         <w:rPr>
           <w:b/>
         </w:rPr>
-        <w:t>Do not</w:t>
-      </w:r>
-      <w:r>
-        <w:t xml:space="preserve"> import HIDAT, Pegasys superiority, ET/MF, pregnancy, or the Novartis early-MF PDF (</w:t>
-      </w:r>
-      <w:r>
-        <w:rPr>
-          <w:rFonts w:ascii="Courier" w:hAnsi="Courier"/>
-        </w:rPr>
-        <w:t>20230508162013_1_slideshow.pdf</w:t>
-      </w:r>
-      <w:r>
-        <w:t>).</w:t>
-      </w:r>
-      <w:r/>
-    </w:p>
-    <w:p>
-      <w:r/>
+        <w:t>Same trials, different analyses — say it on the page.</w:t>
+      </w:r>
+      <w:r>
+        <w:t xml:space="preserve"> Graph month-12 (~62% vs ~75%) is </w:t>
+      </w:r>
       <w:r>
         <w:rPr>
           <w:b/>
         </w:rPr>
-        <w:t>The brochure and this training are the same trials, different analyses.</w:t>
-      </w:r>
-      <w:r>
-        <w:t xml:space="preserve"> The leave-behind graph (~62% vs ~75% at month 12; ~73% at month 60) and </w:t>
-      </w:r>
-      <w:r>
-        <w:rPr>
-          <w:b/>
-        </w:rPr>
-        <w:t>84.3% (107/127) ever-CHR</w:t>
-      </w:r>
-      <w:r>
-        <w:t xml:space="preserve"> will contradict the PI primary (</w:t>
+        <w:t>not</w:t>
+      </w:r>
+      <w:r>
+        <w:t xml:space="preserve"> PI </w:t>
       </w:r>
       <w:r>
         <w:rPr>
@@ -818,22 +835,31 @@
         <w:t>43.1% vs 46%</w:t>
       </w:r>
       <w:r>
-        <w:t xml:space="preserve"> at 12 months; </w:t>
+        <w:t xml:space="preserve">. </w:t>
       </w:r>
       <w:r>
         <w:rPr>
           <w:b/>
         </w:rPr>
-        <w:t>54.5% vs 34.9%</w:t>
-      </w:r>
-      <w:r>
-        <w:t xml:space="preserve"> at 72 months) unless you </w:t>
+        <w:t>84.3%</w:t>
+      </w:r>
+      <w:r>
+        <w:t xml:space="preserve"> is </w:t>
       </w:r>
       <w:r>
         <w:rPr>
           <w:b/>
         </w:rPr>
-        <w:t>name the analysis out loud</w:t>
+        <w:t>ever-CHR</w:t>
+      </w:r>
+      <w:r>
+        <w:t xml:space="preserve">. Late primary is </w:t>
+      </w:r>
+      <w:r>
+        <w:rPr>
+          <w:b/>
+        </w:rPr>
+        <w:t>54.5% vs 34.9%, p=0.02</w:t>
       </w:r>
       <w:r>
         <w:t>.</w:t>
@@ -980,25 +1006,43 @@
       </w:pPr>
       <w:r/>
       <w:r>
-        <w:t xml:space="preserve">Quote year-1 PROUD-PV </w:t>
+        <w:t xml:space="preserve">Walk the </w:t>
       </w:r>
       <w:r>
         <w:rPr>
           <w:b/>
         </w:rPr>
-        <w:t>honestly</w:t>
-      </w:r>
-      <w:r>
-        <w:t xml:space="preserve"> (43% vs 46%, NS) </w:t>
+        <w:t>brochure CHR page</w:t>
+      </w:r>
+      <w:r>
+        <w:t xml:space="preserve">: graph (HU ahead at 1 year, crossover by 24 months), </w:t>
       </w:r>
       <w:r>
         <w:rPr>
           <w:b/>
         </w:rPr>
-        <w:t>then</w:t>
-      </w:r>
-      <w:r>
-        <w:t xml:space="preserve"> 72-month CHR and EFS from named studies.</w:t>
+        <w:t>84.3% = ever-CHR</w:t>
+      </w:r>
+      <w:r>
+        <w:t xml:space="preserve">, then PI </w:t>
+      </w:r>
+      <w:r>
+        <w:rPr>
+          <w:b/>
+        </w:rPr>
+        <w:t>43.1% vs 46%</w:t>
+      </w:r>
+      <w:r>
+        <w:t xml:space="preserve"> and </w:t>
+      </w:r>
+      <w:r>
+        <w:rPr>
+          <w:b/>
+        </w:rPr>
+        <w:t>54.5% vs 34.9% at 72 months</w:t>
+      </w:r>
+      <w:r>
+        <w:t>.</w:t>
       </w:r>
       <w:r/>
     </w:p>
@@ -1010,7 +1054,16 @@
       </w:pPr>
       <w:r/>
       <w:r>
-        <w:t>Counsel trial safety (grade ≥3 similar to HU; more IFN-class discontinuations) without attacking HU.</w:t>
+        <w:t xml:space="preserve">Teach JAK2 </w:t>
+      </w:r>
+      <w:r>
+        <w:rPr>
+          <w:b/>
+        </w:rPr>
+        <w:t>37% → 8% vs 38% → 44%</w:t>
+      </w:r>
+      <w:r>
+        <w:t xml:space="preserve"> as core when that page is handed over; no TFR.</w:t>
       </w:r>
       <w:r/>
     </w:p>
@@ -1022,7 +1075,16 @@
       </w:pPr>
       <w:r/>
       <w:r>
-        <w:t>Handle Pegasys / China ropeg / HIDAT / “it failed at one year” without IFN-to-IFN superiority or off-label dosing.</w:t>
+        <w:t xml:space="preserve">Counsel the </w:t>
+      </w:r>
+      <w:r>
+        <w:rPr>
+          <w:b/>
+        </w:rPr>
+        <w:t>36-month all-causality table</w:t>
+      </w:r>
+      <w:r>
+        <w:t xml:space="preserve"> (liver enzymes, not worse cytopenias) plus drug-related D/C ~11% vs 2–3%.</w:t>
       </w:r>
       <w:r/>
     </w:p>
@@ -1034,16 +1096,7 @@
       </w:pPr>
       <w:r/>
       <w:r>
-        <w:t xml:space="preserve">Start, titrate, and stop per HK PI (100/50 µg — </w:t>
-      </w:r>
-      <w:r>
-        <w:rPr>
-          <w:b/>
-        </w:rPr>
-        <w:t>not</w:t>
-      </w:r>
-      <w:r>
-        <w:t xml:space="preserve"> 250–350–500); report ADRs; describe PSP only as currently approved.</w:t>
+        <w:t>Handle Pegasys / HIDAT / “it failed at one year” / “84% respond” without IFN-to-IFN superiority or mixing analyses.</w:t>
       </w:r>
       <w:r/>
       <w:r/>
@@ -1208,6 +1261,437 @@
       <w:r>
         <w:t>Talk-track (use this order)</w:t>
       </w:r>
+      <w:r/>
+    </w:p>
+    <w:p>
+      <w:pPr>
+        <w:pStyle w:val="Heading3"/>
+      </w:pPr>
+      <w:r>
+        <w:t>0. Default HCP 1:1 — walk the brochure (12–20 min)</w:t>
+      </w:r>
+      <w:r/>
+    </w:p>
+    <w:p>
+      <w:r/>
+      <w:r>
+        <w:t xml:space="preserve">Skip Piece A diagnosis if the physician is a senior haematologist. Open the leave-behind. Speak </w:t>
+      </w:r>
+      <w:r>
+        <w:rPr>
+          <w:b/>
+        </w:rPr>
+        <w:t>on the page</w:t>
+      </w:r>
+      <w:r>
+        <w:t>.</w:t>
+      </w:r>
+      <w:r/>
+    </w:p>
+    <w:tbl>
+      <w:tblPr>
+        <w:tblStyle w:val="TableGrid"/>
+        <w:tblW w:type="auto" w:w="0"/>
+        <w:tblLook w:firstColumn="1" w:firstRow="1" w:lastColumn="0" w:lastRow="0" w:noHBand="0" w:noVBand="1" w:val="04A0"/>
+      </w:tblPr>
+      <w:tblGrid>
+        <w:gridCol w:w="4824"/>
+        <w:gridCol w:w="4824"/>
+      </w:tblGrid>
+      <w:tr>
+        <w:tc>
+          <w:tcPr>
+            <w:tcW w:type="dxa" w:w="4824"/>
+          </w:tcPr>
+          <w:p>
+            <w:r>
+              <w:rPr>
+                <w:b/>
+              </w:rPr>
+              <w:t>Page</w:t>
+            </w:r>
+          </w:p>
+        </w:tc>
+        <w:tc>
+          <w:tcPr>
+            <w:tcW w:type="dxa" w:w="4824"/>
+          </w:tcPr>
+          <w:p>
+            <w:r>
+              <w:rPr>
+                <w:b/>
+              </w:rPr>
+              <w:t>What you say (short)</w:t>
+            </w:r>
+          </w:p>
+        </w:tc>
+      </w:tr>
+      <w:tr>
+        <w:tc>
+          <w:tcPr>
+            <w:tcW w:type="dxa" w:w="4824"/>
+          </w:tcPr>
+          <w:p>
+            <w:r>
+              <w:t>Open</w:t>
+            </w:r>
+          </w:p>
+        </w:tc>
+        <w:tc>
+          <w:tcPr>
+            <w:tcW w:type="dxa" w:w="4824"/>
+          </w:tcPr>
+          <w:p>
+            <w:r>
+              <w:t xml:space="preserve">Adult PV </w:t>
+            </w:r>
+            <w:r>
+              <w:rPr>
+                <w:b/>
+              </w:rPr>
+              <w:t>without symptomatic splenomegaly</w:t>
+            </w:r>
+            <w:r>
+              <w:t xml:space="preserve"> . Ask how they cytoreduce today.</w:t>
+            </w:r>
+          </w:p>
+        </w:tc>
+      </w:tr>
+      <w:tr>
+        <w:tc>
+          <w:tcPr>
+            <w:tcW w:type="dxa" w:w="4824"/>
+          </w:tcPr>
+          <w:p>
+            <w:r>
+              <w:t>CHR graph</w:t>
+            </w:r>
+          </w:p>
+        </w:tc>
+        <w:tc>
+          <w:tcPr>
+            <w:tcW w:type="dxa" w:w="4824"/>
+          </w:tcPr>
+          <w:p>
+            <w:r>
+              <w:t xml:space="preserve">HU ~ </w:t>
+            </w:r>
+            <w:r>
+              <w:rPr>
+                <w:b/>
+              </w:rPr>
+              <w:t>75% vs 62%</w:t>
+            </w:r>
+            <w:r>
+              <w:t xml:space="preserve"> at 12 months; crossover by 24; ~ </w:t>
+            </w:r>
+            <w:r>
+              <w:rPr>
+                <w:b/>
+              </w:rPr>
+              <w:t>73% vs 53%</w:t>
+            </w:r>
+            <w:r>
+              <w:t xml:space="preserve"> at 60. HU is faster (PI 2.6 vs 3.7 months).</w:t>
+            </w:r>
+          </w:p>
+        </w:tc>
+      </w:tr>
+      <w:tr>
+        <w:tc>
+          <w:tcPr>
+            <w:tcW w:type="dxa" w:w="4824"/>
+          </w:tcPr>
+          <w:p>
+            <w:r>
+              <w:t>84.3% (107/127)</w:t>
+            </w:r>
+          </w:p>
+        </w:tc>
+        <w:tc>
+          <w:tcPr>
+            <w:tcW w:type="dxa" w:w="4824"/>
+          </w:tcPr>
+          <w:p>
+            <w:r>
+              <w:rPr>
+                <w:b/>
+              </w:rPr>
+              <w:t>Ever-CHR</w:t>
+            </w:r>
+            <w:r>
+              <w:t xml:space="preserve"> by 36 months — criteria met </w:t>
+            </w:r>
+            <w:r>
+              <w:rPr>
+                <w:b/>
+              </w:rPr>
+              <w:t>at any time</w:t>
+            </w:r>
+            <w:r>
+              <w:t xml:space="preserve"> . Not the snapshot.</w:t>
+            </w:r>
+          </w:p>
+        </w:tc>
+      </w:tr>
+      <w:tr>
+        <w:tc>
+          <w:tcPr>
+            <w:tcW w:type="dxa" w:w="4824"/>
+          </w:tcPr>
+          <w:p>
+            <w:r>
+              <w:t>Translation</w:t>
+            </w:r>
+          </w:p>
+        </w:tc>
+        <w:tc>
+          <w:tcPr>
+            <w:tcW w:type="dxa" w:w="4824"/>
+          </w:tcPr>
+          <w:p>
+            <w:r>
+              <w:t xml:space="preserve">PI 12-mo </w:t>
+            </w:r>
+            <w:r>
+              <w:rPr>
+                <w:b/>
+              </w:rPr>
+              <w:t>43.1% vs 46.0%, p=0.63</w:t>
+            </w:r>
+            <w:r>
+              <w:t xml:space="preserve"> (discontinued = fail). Late primary </w:t>
+            </w:r>
+            <w:r>
+              <w:rPr>
+                <w:b/>
+              </w:rPr>
+              <w:t>54.5% vs 34.9%, p=0.02</w:t>
+            </w:r>
+            <w:r>
+              <w:t xml:space="preserve"> . LOCF 72.6% vs 47.3% ≈ this graph.</w:t>
+            </w:r>
+          </w:p>
+        </w:tc>
+      </w:tr>
+      <w:tr>
+        <w:tc>
+          <w:tcPr>
+            <w:tcW w:type="dxa" w:w="4824"/>
+          </w:tcPr>
+          <w:p>
+            <w:r>
+              <w:t>3% (4/127) TE</w:t>
+            </w:r>
+          </w:p>
+        </w:tc>
+        <w:tc>
+          <w:tcPr>
+            <w:tcW w:type="dxa" w:w="4824"/>
+          </w:tcPr>
+          <w:p>
+            <w:r>
+              <w:t xml:space="preserve">36-month major TE on n=127. </w:t>
+            </w:r>
+            <w:r>
+              <w:rPr>
+                <w:b/>
+              </w:rPr>
+              <w:t>Not</w:t>
+            </w:r>
+            <w:r>
+              <w:t xml:space="preserve"> EFS 5/95.</w:t>
+            </w:r>
+          </w:p>
+        </w:tc>
+      </w:tr>
+      <w:tr>
+        <w:tc>
+          <w:tcPr>
+            <w:tcW w:type="dxa" w:w="4824"/>
+          </w:tcPr>
+          <w:p>
+            <w:r>
+              <w:t>JAK2</w:t>
+            </w:r>
+          </w:p>
+        </w:tc>
+        <w:tc>
+          <w:tcPr>
+            <w:tcW w:type="dxa" w:w="4824"/>
+          </w:tcPr>
+          <w:p>
+            <w:r>
+              <w:rPr>
+                <w:b/>
+              </w:rPr>
+              <w:t>37% → 8%</w:t>
+            </w:r>
+            <w:r>
+              <w:t xml:space="preserve"> vs </w:t>
+            </w:r>
+            <w:r>
+              <w:rPr>
+                <w:b/>
+              </w:rPr>
+              <w:t>38% → 44%</w:t>
+            </w:r>
+            <w:r>
+              <w:t xml:space="preserve"> at 60 months. No stopping rule, no TFR.</w:t>
+            </w:r>
+          </w:p>
+        </w:tc>
+      </w:tr>
+      <w:tr>
+        <w:tc>
+          <w:tcPr>
+            <w:tcW w:type="dxa" w:w="4824"/>
+          </w:tcPr>
+          <w:p>
+            <w:r>
+              <w:t>EFS KM</w:t>
+            </w:r>
+          </w:p>
+        </w:tc>
+        <w:tc>
+          <w:tcPr>
+            <w:tcW w:type="dxa" w:w="4824"/>
+          </w:tcPr>
+          <w:p>
+            <w:r>
+              <w:rPr>
+                <w:b/>
+              </w:rPr>
+              <w:t>5/95 vs 12/74, p=0.04</w:t>
+            </w:r>
+            <w:r>
+              <w:t xml:space="preserve"> . Progression, death, TE. </w:t>
+            </w:r>
+            <w:r>
+              <w:rPr>
+                <w:b/>
+              </w:rPr>
+              <w:t>EFS ≠ OS.</w:t>
+            </w:r>
+            <w:r>
+              <w:t xml:space="preserve"> No “prevents leukemia.”</w:t>
+            </w:r>
+          </w:p>
+        </w:tc>
+      </w:tr>
+      <w:tr>
+        <w:tc>
+          <w:tcPr>
+            <w:tcW w:type="dxa" w:w="4824"/>
+          </w:tcPr>
+          <w:p>
+            <w:r>
+              <w:t>Safety p.9</w:t>
+            </w:r>
+          </w:p>
+        </w:tc>
+        <w:tc>
+          <w:tcPr>
+            <w:tcW w:type="dxa" w:w="4824"/>
+          </w:tcPr>
+          <w:p>
+            <w:r>
+              <w:t xml:space="preserve">Counts not worse vs HU. </w:t>
+            </w:r>
+            <w:r>
+              <w:rPr>
+                <w:b/>
+              </w:rPr>
+              <w:t>GGT 16% vs 2%</w:t>
+            </w:r>
+            <w:r>
+              <w:t xml:space="preserve"> (G≥3 8% vs 2%). D/C ~11% vs 2–3% is a different cut.</w:t>
+            </w:r>
+          </w:p>
+        </w:tc>
+      </w:tr>
+      <w:tr>
+        <w:tc>
+          <w:tcPr>
+            <w:tcW w:type="dxa" w:w="4824"/>
+          </w:tcPr>
+          <w:p>
+            <w:r>
+              <w:t>PI</w:t>
+            </w:r>
+          </w:p>
+        </w:tc>
+        <w:tc>
+          <w:tcPr>
+            <w:tcW w:type="dxa" w:w="4824"/>
+          </w:tcPr>
+          <w:p>
+            <w:r>
+              <w:t xml:space="preserve">Start </w:t>
+            </w:r>
+            <w:r>
+              <w:rPr>
+                <w:b/>
+              </w:rPr>
+              <w:t>100/50 µg</w:t>
+            </w:r>
+            <w:r>
+              <w:t xml:space="preserve"> , +50 q2w, max 500, may q4w after 1.5 y. Thyroid CI. </w:t>
+            </w:r>
+            <w:r>
+              <w:rPr>
+                <w:b/>
+              </w:rPr>
+              <w:t>Not HIDAT.</w:t>
+            </w:r>
+          </w:p>
+        </w:tc>
+      </w:tr>
+      <w:tr>
+        <w:tc>
+          <w:tcPr>
+            <w:tcW w:type="dxa" w:w="4824"/>
+          </w:tcPr>
+          <w:p>
+            <w:r>
+              <w:t>Close</w:t>
+            </w:r>
+          </w:p>
+        </w:tc>
+        <w:tc>
+          <w:tcPr>
+            <w:tcW w:type="dxa" w:w="4824"/>
+          </w:tcPr>
+          <w:p>
+            <w:r>
+              <w:t>One suitable patient, or the barrier. PSP only if terms confirmed.</w:t>
+            </w:r>
+          </w:p>
+        </w:tc>
+      </w:tr>
+    </w:tbl>
+    <w:p>
+      <w:r/>
+    </w:p>
+    <w:p>
+      <w:r/>
+      <w:r>
+        <w:rPr>
+          <w:b/>
+        </w:rPr>
+        <w:t>Prof. Liang today:</w:t>
+      </w:r>
+      <w:r>
+        <w:t xml:space="preserve"> use the dedicated script — do not run the 60-minute certification deck.</w:t>
+      </w:r>
+      <w:r/>
+    </w:p>
+    <w:p>
+      <w:pPr>
+        <w:pBdr>
+          <w:bottom w:val="single" w:sz="6" w:space="1" w:color="auto"/>
+        </w:pBdr>
+      </w:pPr>
       <w:r/>
     </w:p>
     <w:p>
@@ -3589,7 +4073,7 @@
         <w:pStyle w:val="Heading3"/>
       </w:pPr>
       <w:r>
-        <w:t>8. Piece B — BESREMi complete hematologic response (6 min)</w:t>
+        <w:t>8. Brochure CHR page — walk what they will hold (6 min)</w:t>
       </w:r>
       <w:r/>
     </w:p>
@@ -3599,7 +4083,7 @@
         <w:rPr>
           <w:b/>
         </w:rPr>
-        <w:t>CHR definition (Piece B):</w:t>
+        <w:t>CHR definition (on the page):</w:t>
       </w:r>
       <w:r>
         <w:t xml:space="preserve"> no phlebotomy in the past 3 months; hematocrit &lt;45%; leukocytes &lt;10 × 10⁹/L; platelets &lt;400 × 10⁹/L.</w:t>
@@ -3612,43 +4096,172 @@
         <w:rPr>
           <w:b/>
         </w:rPr>
-        <w:t>Poster claim:</w:t>
-      </w:r>
-      <w:r>
-        <w:t xml:space="preserve"> greater CHR vs control (HU/BAT) at 24 months, </w:t>
-      </w:r>
+        <w:t>Speak in this order (brochure first, PI second):</w:t>
+      </w:r>
+      <w:r/>
+      <w:r/>
+    </w:p>
+    <w:p>
+      <w:pPr>
+        <w:pStyle w:val="ListNumber"/>
+        <w:spacing w:line="240" w:lineRule="auto"/>
+        <w:ind w:left="720"/>
+      </w:pPr>
+      <w:r/>
       <w:r>
         <w:rPr>
           <w:b/>
         </w:rPr>
-        <w:t>sustained through 60 months</w:t>
-      </w:r>
-      <w:r>
-        <w:t>.</w:t>
-      </w:r>
-      <w:r/>
-    </w:p>
-    <w:p>
-      <w:r/>
+        <w:t>Graph:</w:t>
+      </w:r>
+      <w:r>
+        <w:t xml:space="preserve"> HU is ahead at </w:t>
+      </w:r>
       <w:r>
         <w:rPr>
           <w:b/>
         </w:rPr>
-        <w:t xml:space="preserve">Numbers to use in HK (named study — Gisslinger et al., </w:t>
-      </w:r>
-      <w:r>
-        <w:rPr>
-          <w:b/>
-          <w:i/>
-        </w:rPr>
-        <w:t>Leukemia</w:t>
+        <w:t>12 months (~75% vs ~62%)</w:t>
+      </w:r>
+      <w:r>
+        <w:t xml:space="preserve">. Lines </w:t>
       </w:r>
       <w:r>
         <w:rPr>
           <w:b/>
         </w:rPr>
-        <w:t xml:space="preserve"> 2023; PROUD-PV / CONTINUATION-PV):</w:t>
-      </w:r>
+        <w:t>cross by 24 months</w:t>
+      </w:r>
+      <w:r>
+        <w:t xml:space="preserve">. At </w:t>
+      </w:r>
+      <w:r>
+        <w:rPr>
+          <w:b/>
+        </w:rPr>
+        <w:t>60 months ~73% vs ~53%</w:t>
+      </w:r>
+      <w:r>
+        <w:t>. Headline on the art: greater CHR vs control at 24 months, sustained at 60 months.</w:t>
+      </w:r>
+      <w:r/>
+    </w:p>
+    <w:p>
+      <w:pPr>
+        <w:pStyle w:val="ListNumber"/>
+        <w:spacing w:line="240" w:lineRule="auto"/>
+        <w:ind w:left="720"/>
+      </w:pPr>
+      <w:r/>
+      <w:r>
+        <w:rPr>
+          <w:b/>
+        </w:rPr>
+        <w:t>84.3% (107/127):</w:t>
+      </w:r>
+      <w:r>
+        <w:t xml:space="preserve"> </w:t>
+      </w:r>
+      <w:r>
+        <w:rPr>
+          <w:b/>
+        </w:rPr>
+        <w:t>ever-CHR</w:t>
+      </w:r>
+      <w:r>
+        <w:t xml:space="preserve"> by 36 months — criteria met </w:t>
+      </w:r>
+      <w:r>
+        <w:rPr>
+          <w:b/>
+        </w:rPr>
+        <w:t>at any time</w:t>
+      </w:r>
+      <w:r>
+        <w:t xml:space="preserve"> (footnote). Not “84% still in CHR.”</w:t>
+      </w:r>
+      <w:r/>
+    </w:p>
+    <w:p>
+      <w:pPr>
+        <w:pStyle w:val="ListNumber"/>
+        <w:spacing w:line="240" w:lineRule="auto"/>
+        <w:ind w:left="720"/>
+      </w:pPr>
+      <w:r/>
+      <w:r>
+        <w:rPr>
+          <w:b/>
+        </w:rPr>
+        <w:t>Major TE 3% (4/127)</w:t>
+      </w:r>
+      <w:r>
+        <w:t xml:space="preserve"> at 36 months — do </w:t>
+      </w:r>
+      <w:r>
+        <w:rPr>
+          <w:b/>
+        </w:rPr>
+        <w:t>not</w:t>
+      </w:r>
+      <w:r>
+        <w:t xml:space="preserve"> mix with EFS 5/95.</w:t>
+      </w:r>
+      <w:r/>
+    </w:p>
+    <w:p>
+      <w:pPr>
+        <w:pStyle w:val="ListNumber"/>
+        <w:spacing w:line="240" w:lineRule="auto"/>
+        <w:ind w:left="720"/>
+      </w:pPr>
+      <w:r/>
+      <w:r>
+        <w:rPr>
+          <w:b/>
+        </w:rPr>
+        <w:t>PI translation (must still say):</w:t>
+      </w:r>
+      <w:r>
+        <w:t xml:space="preserve"> 12-month primary </w:t>
+      </w:r>
+      <w:r>
+        <w:rPr>
+          <w:b/>
+        </w:rPr>
+        <w:t>43.1% vs 46.0%, p=0.63</w:t>
+      </w:r>
+      <w:r>
+        <w:t xml:space="preserve"> (ITT; discontinued = failure; non-inferiority not met). Late primary </w:t>
+      </w:r>
+      <w:r>
+        <w:rPr>
+          <w:b/>
+        </w:rPr>
+        <w:t>54.5% vs 34.9% at 72 months, p=0.02</w:t>
+      </w:r>
+      <w:r>
+        <w:t xml:space="preserve"> (Gisslinger 2023). LOCF </w:t>
+      </w:r>
+      <w:r>
+        <w:rPr>
+          <w:b/>
+        </w:rPr>
+        <w:t>72.6% vs 47.3%</w:t>
+      </w:r>
+      <w:r>
+        <w:t xml:space="preserve"> is the published analogue of the ~70% graph. Mean time in CHR </w:t>
+      </w:r>
+      <w:r>
+        <w:rPr>
+          <w:b/>
+        </w:rPr>
+        <w:t>60.9% vs 41.2%</w:t>
+      </w:r>
+      <w:r>
+        <w:t xml:space="preserve"> (p=0.04).</w:t>
+      </w:r>
+      <w:r/>
       <w:r/>
     </w:p>
     <w:tbl>
@@ -3658,15 +4271,16 @@
         <w:tblLook w:firstColumn="1" w:firstRow="1" w:lastColumn="0" w:lastRow="0" w:noHBand="0" w:noVBand="1" w:val="04A0"/>
       </w:tblPr>
       <w:tblGrid>
-        <w:gridCol w:w="2412"/>
-        <w:gridCol w:w="2412"/>
-        <w:gridCol w:w="2412"/>
-        <w:gridCol w:w="2412"/>
+        <w:gridCol w:w="1930"/>
+        <w:gridCol w:w="1930"/>
+        <w:gridCol w:w="1930"/>
+        <w:gridCol w:w="1930"/>
+        <w:gridCol w:w="1930"/>
       </w:tblGrid>
       <w:tr>
         <w:tc>
           <w:tcPr>
-            <w:tcW w:type="dxa" w:w="2412"/>
+            <w:tcW w:type="dxa" w:w="1930"/>
           </w:tcPr>
           <w:p>
             <w:r>
@@ -3679,7 +4293,7 @@
         </w:tc>
         <w:tc>
           <w:tcPr>
-            <w:tcW w:type="dxa" w:w="2412"/>
+            <w:tcW w:type="dxa" w:w="1930"/>
           </w:tcPr>
           <w:p>
             <w:r>
@@ -3692,7 +4306,7 @@
         </w:tc>
         <w:tc>
           <w:tcPr>
-            <w:tcW w:type="dxa" w:w="2412"/>
+            <w:tcW w:type="dxa" w:w="1930"/>
           </w:tcPr>
           <w:p>
             <w:r>
@@ -3705,7 +4319,7 @@
         </w:tc>
         <w:tc>
           <w:tcPr>
-            <w:tcW w:type="dxa" w:w="2412"/>
+            <w:tcW w:type="dxa" w:w="1930"/>
           </w:tcPr>
           <w:p>
             <w:r>
@@ -3713,6 +4327,19 @@
                 <w:b/>
               </w:rPr>
               <w:t>Stats</w:t>
+            </w:r>
+          </w:p>
+        </w:tc>
+        <w:tc>
+          <w:tcPr>
+            <w:tcW w:type="dxa" w:w="1930"/>
+          </w:tcPr>
+          <w:p>
+            <w:r>
+              <w:rPr>
+                <w:b/>
+              </w:rPr>
+              <w:t>Role</w:t>
             </w:r>
           </w:p>
         </w:tc>
@@ -3720,62 +4347,51 @@
       <w:tr>
         <w:tc>
           <w:tcPr>
-            <w:tcW w:type="dxa" w:w="2412"/>
+            <w:tcW w:type="dxa" w:w="1930"/>
           </w:tcPr>
           <w:p>
             <w:r>
-              <w:rPr>
-                <w:b/>
-              </w:rPr>
-              <w:t>CHR at 72 months (primary; discontinued = non-responders)</w:t>
+              <w:t>Brochure graph, ~M12</w:t>
             </w:r>
           </w:p>
         </w:tc>
         <w:tc>
           <w:tcPr>
-            <w:tcW w:type="dxa" w:w="2412"/>
+            <w:tcW w:type="dxa" w:w="1930"/>
           </w:tcPr>
           <w:p>
             <w:r>
-              <w:rPr>
-                <w:b/>
-              </w:rPr>
-              <w:t>54.5%</w:t>
-            </w:r>
-            <w:r>
-              <w:t xml:space="preserve"> (48/88)</w:t>
+              <w:t>~62%</w:t>
             </w:r>
           </w:p>
         </w:tc>
         <w:tc>
           <w:tcPr>
-            <w:tcW w:type="dxa" w:w="2412"/>
+            <w:tcW w:type="dxa" w:w="1930"/>
           </w:tcPr>
           <w:p>
             <w:r>
-              <w:rPr>
-                <w:b/>
-              </w:rPr>
-              <w:t>34.9%</w:t>
-            </w:r>
-            <w:r>
-              <w:t xml:space="preserve"> (22/63)</w:t>
+              <w:t>~75%</w:t>
             </w:r>
           </w:p>
         </w:tc>
         <w:tc>
           <w:tcPr>
-            <w:tcW w:type="dxa" w:w="2412"/>
+            <w:tcW w:type="dxa" w:w="1930"/>
           </w:tcPr>
           <w:p>
             <w:r>
-              <w:t xml:space="preserve">RR 1.55; 95% CI 1.07–2.26; </w:t>
-            </w:r>
-            <w:r>
-              <w:rPr>
-                <w:b/>
-              </w:rPr>
-              <w:t>p=0.02</w:t>
+              <w:t>Visual on leave-behind</w:t>
+            </w:r>
+          </w:p>
+        </w:tc>
+        <w:tc>
+          <w:tcPr>
+            <w:tcW w:type="dxa" w:w="1930"/>
+          </w:tcPr>
+          <w:p>
+            <w:r>
+              <w:t>HU faster at 1 year</w:t>
             </w:r>
           </w:p>
         </w:tc>
@@ -3783,41 +4399,51 @@
       <w:tr>
         <w:tc>
           <w:tcPr>
-            <w:tcW w:type="dxa" w:w="2412"/>
+            <w:tcW w:type="dxa" w:w="1930"/>
           </w:tcPr>
           <w:p>
             <w:r>
-              <w:t>LOCF sensitivity (explains the poster’s ~70% visual)</w:t>
+              <w:t>Brochure graph, ~M60</w:t>
             </w:r>
           </w:p>
         </w:tc>
         <w:tc>
           <w:tcPr>
-            <w:tcW w:type="dxa" w:w="2412"/>
+            <w:tcW w:type="dxa" w:w="1930"/>
           </w:tcPr>
           <w:p>
             <w:r>
-              <w:t>72.6% (69/95)</w:t>
+              <w:t>~73%</w:t>
             </w:r>
           </w:p>
         </w:tc>
         <w:tc>
           <w:tcPr>
-            <w:tcW w:type="dxa" w:w="2412"/>
+            <w:tcW w:type="dxa" w:w="1930"/>
           </w:tcPr>
           <w:p>
             <w:r>
-              <w:t>47.3% (35/74)</w:t>
+              <w:t>~53%</w:t>
             </w:r>
           </w:p>
         </w:tc>
         <w:tc>
           <w:tcPr>
-            <w:tcW w:type="dxa" w:w="2412"/>
+            <w:tcW w:type="dxa" w:w="1930"/>
           </w:tcPr>
           <w:p>
             <w:r>
-              <w:t>RR 1.54; 95% CI 1.18–2.00; p=0.001</w:t>
+              <w:t>Visual on leave-behind</w:t>
+            </w:r>
+          </w:p>
+        </w:tc>
+        <w:tc>
+          <w:tcPr>
+            <w:tcW w:type="dxa" w:w="1930"/>
+          </w:tcPr>
+          <w:p>
+            <w:r>
+              <w:t>Long-term curve</w:t>
             </w:r>
           </w:p>
         </w:tc>
@@ -3825,93 +4451,54 @@
       <w:tr>
         <w:tc>
           <w:tcPr>
-            <w:tcW w:type="dxa" w:w="2412"/>
+            <w:tcW w:type="dxa" w:w="1930"/>
           </w:tcPr>
           <w:p>
             <w:r>
-              <w:t>Mean time in CHR</w:t>
+              <w:t>Ever-CHR by 36 mo</w:t>
             </w:r>
           </w:p>
         </w:tc>
         <w:tc>
           <w:tcPr>
-            <w:tcW w:type="dxa" w:w="2412"/>
+            <w:tcW w:type="dxa" w:w="1930"/>
           </w:tcPr>
           <w:p>
             <w:r>
-              <w:t>60.9%</w:t>
+              <w:rPr>
+                <w:b/>
+              </w:rPr>
+              <w:t>84.3% (107/127)</w:t>
             </w:r>
           </w:p>
         </w:tc>
         <w:tc>
           <w:tcPr>
-            <w:tcW w:type="dxa" w:w="2412"/>
+            <w:tcW w:type="dxa" w:w="1930"/>
           </w:tcPr>
           <w:p>
             <w:r>
-              <w:t>41.2%</w:t>
+              <w:t>—</w:t>
             </w:r>
           </w:p>
         </w:tc>
         <w:tc>
           <w:tcPr>
-            <w:tcW w:type="dxa" w:w="2412"/>
+            <w:tcW w:type="dxa" w:w="1930"/>
           </w:tcPr>
           <w:p>
             <w:r>
-              <w:t>p=0.04</w:t>
-            </w:r>
-          </w:p>
-        </w:tc>
-      </w:tr>
-    </w:tbl>
-    <w:p>
-      <w:r/>
-    </w:p>
-    <w:p>
-      <w:r/>
-      <w:r>
-        <w:rPr>
-          <w:b/>
-        </w:rPr>
-        <w:t>Field rule — three CHR numbers, say which one is on the page:</w:t>
-      </w:r>
-      <w:r/>
-    </w:p>
-    <w:tbl>
-      <w:tblPr>
-        <w:tblStyle w:val="TableGrid"/>
-        <w:tblW w:type="auto" w:w="0"/>
-        <w:tblLook w:firstColumn="1" w:firstRow="1" w:lastColumn="0" w:lastRow="0" w:noHBand="0" w:noVBand="1" w:val="04A0"/>
-      </w:tblPr>
-      <w:tblGrid>
-        <w:gridCol w:w="4824"/>
-        <w:gridCol w:w="4824"/>
-      </w:tblGrid>
-      <w:tr>
-        <w:tc>
-          <w:tcPr>
-            <w:tcW w:type="dxa" w:w="4824"/>
-          </w:tcPr>
-          <w:p>
-            <w:r>
-              <w:rPr>
-                <w:b/>
-              </w:rPr>
-              <w:t>If they are looking at…</w:t>
+              <w:t>Footnote: at any time</w:t>
             </w:r>
           </w:p>
         </w:tc>
         <w:tc>
           <w:tcPr>
-            <w:tcW w:type="dxa" w:w="4824"/>
+            <w:tcW w:type="dxa" w:w="1930"/>
           </w:tcPr>
           <w:p>
             <w:r>
-              <w:rPr>
-                <w:b/>
-              </w:rPr>
-              <w:t>You say</w:t>
+              <w:t>Not a snapshot</w:t>
             </w:r>
           </w:p>
         </w:tc>
@@ -3919,39 +4506,60 @@
       <w:tr>
         <w:tc>
           <w:tcPr>
-            <w:tcW w:type="dxa" w:w="4824"/>
+            <w:tcW w:type="dxa" w:w="1930"/>
           </w:tcPr>
           <w:p>
             <w:r>
-              <w:t xml:space="preserve">Brochure </w:t>
-            </w:r>
-            <w:r>
-              <w:rPr>
-                <w:b/>
-              </w:rPr>
-              <w:t>5-year graph</w:t>
-            </w:r>
-            <w:r>
-              <w:t xml:space="preserve"> (~62% vs ~75% at M12; crossover by M24; ~73% vs ~53% at M60)</w:t>
+              <w:t>PI 12-mo primary</w:t>
             </w:r>
           </w:p>
         </w:tc>
         <w:tc>
           <w:tcPr>
-            <w:tcW w:type="dxa" w:w="4824"/>
+            <w:tcW w:type="dxa" w:w="1930"/>
           </w:tcPr>
           <w:p>
-            <w:r>
-              <w:t xml:space="preserve">“This is the long-term CHR </w:t>
-            </w:r>
             <w:r>
               <w:rPr>
                 <w:b/>
               </w:rPr>
-              <w:t>curve on this leave-behind</w:t>
-            </w:r>
-            <w:r>
-              <w:t xml:space="preserve"> . HU is ahead at 1 year; ropeg crosses and holds.”</w:t>
+              <w:t>43.1%</w:t>
+            </w:r>
+          </w:p>
+        </w:tc>
+        <w:tc>
+          <w:tcPr>
+            <w:tcW w:type="dxa" w:w="1930"/>
+          </w:tcPr>
+          <w:p>
+            <w:r>
+              <w:rPr>
+                <w:b/>
+              </w:rPr>
+              <w:t>46.0%</w:t>
+            </w:r>
+          </w:p>
+        </w:tc>
+        <w:tc>
+          <w:tcPr>
+            <w:tcW w:type="dxa" w:w="1930"/>
+          </w:tcPr>
+          <w:p>
+            <w:r>
+              <w:rPr>
+                <w:b/>
+              </w:rPr>
+              <w:t>p=0.63</w:t>
+            </w:r>
+          </w:p>
+        </w:tc>
+        <w:tc>
+          <w:tcPr>
+            <w:tcW w:type="dxa" w:w="1930"/>
+          </w:tcPr>
+          <w:p>
+            <w:r>
+              <w:t>Honesty</w:t>
             </w:r>
           </w:p>
         </w:tc>
@@ -3959,45 +4567,66 @@
       <w:tr>
         <w:tc>
           <w:tcPr>
-            <w:tcW w:type="dxa" w:w="4824"/>
+            <w:tcW w:type="dxa" w:w="1930"/>
           </w:tcPr>
           <w:p>
             <w:r>
-              <w:t xml:space="preserve">Brochure </w:t>
-            </w:r>
-            <w:r>
-              <w:rPr>
-                <w:b/>
-              </w:rPr>
-              <w:t>84.3% (107/127)</w:t>
+              <w:t>72-mo primary (D/C = fail)</w:t>
             </w:r>
           </w:p>
         </w:tc>
         <w:tc>
           <w:tcPr>
-            <w:tcW w:type="dxa" w:w="4824"/>
+            <w:tcW w:type="dxa" w:w="1930"/>
           </w:tcPr>
           <w:p>
-            <w:r>
-              <w:t xml:space="preserve">“ </w:t>
-            </w:r>
             <w:r>
               <w:rPr>
                 <w:b/>
               </w:rPr>
-              <w:t>Ever</w:t>
-            </w:r>
-            <w:r>
-              <w:t xml:space="preserve"> achieved CHR by 36 months — criteria met </w:t>
-            </w:r>
+              <w:t>54.5%</w:t>
+            </w:r>
+            <w:r>
+              <w:t xml:space="preserve"> (48/88)</w:t>
+            </w:r>
+          </w:p>
+        </w:tc>
+        <w:tc>
+          <w:tcPr>
+            <w:tcW w:type="dxa" w:w="1930"/>
+          </w:tcPr>
+          <w:p>
             <w:r>
               <w:rPr>
                 <w:b/>
               </w:rPr>
-              <w:t>at any time</w:t>
-            </w:r>
-            <w:r>
-              <w:t xml:space="preserve"> . Not the snapshot on the graph.”</w:t>
+              <w:t>34.9%</w:t>
+            </w:r>
+            <w:r>
+              <w:t xml:space="preserve"> (22/63)</w:t>
+            </w:r>
+          </w:p>
+        </w:tc>
+        <w:tc>
+          <w:tcPr>
+            <w:tcW w:type="dxa" w:w="1930"/>
+          </w:tcPr>
+          <w:p>
+            <w:r>
+              <w:rPr>
+                <w:b/>
+              </w:rPr>
+              <w:t>p=0.02</w:t>
+            </w:r>
+          </w:p>
+        </w:tc>
+        <w:tc>
+          <w:tcPr>
+            <w:tcW w:type="dxa" w:w="1930"/>
+          </w:tcPr>
+          <w:p>
+            <w:r>
+              <w:t>PI-aligned late number</w:t>
             </w:r>
           </w:p>
         </w:tc>
@@ -4005,58 +4634,51 @@
       <w:tr>
         <w:tc>
           <w:tcPr>
-            <w:tcW w:type="dxa" w:w="4824"/>
+            <w:tcW w:type="dxa" w:w="1930"/>
           </w:tcPr>
           <w:p>
             <w:r>
-              <w:t>HK PI / haematologist who remembers PROUD-PV</w:t>
+              <w:t>LOCF 72 mo</w:t>
             </w:r>
           </w:p>
         </w:tc>
         <w:tc>
           <w:tcPr>
-            <w:tcW w:type="dxa" w:w="4824"/>
+            <w:tcW w:type="dxa" w:w="1930"/>
           </w:tcPr>
           <w:p>
             <w:r>
-              <w:t xml:space="preserve">“12-month primary </w:t>
-            </w:r>
-            <w:r>
-              <w:rPr>
-                <w:b/>
-              </w:rPr>
-              <w:t>43.1% vs 46.0%, p=0.63</w:t>
-            </w:r>
-            <w:r>
-              <w:t xml:space="preserve"> — discontinued counted as failures; non-inferiority not met.”</w:t>
-            </w:r>
-          </w:p>
-        </w:tc>
-      </w:tr>
-      <w:tr>
-        <w:tc>
-          <w:tcPr>
-            <w:tcW w:type="dxa" w:w="4824"/>
-          </w:tcPr>
-          <w:p>
-            <w:r>
-              <w:t>“What is the PI-aligned late number?”</w:t>
+              <w:t>72.6% (69/95)</w:t>
             </w:r>
           </w:p>
         </w:tc>
         <w:tc>
           <w:tcPr>
-            <w:tcW w:type="dxa" w:w="4824"/>
+            <w:tcW w:type="dxa" w:w="1930"/>
           </w:tcPr>
           <w:p>
             <w:r>
-              <w:rPr>
-                <w:b/>
-              </w:rPr>
-              <w:t>54.5% vs 34.9% at 72 months, p=0.02</w:t>
-            </w:r>
-            <w:r>
-              <w:t xml:space="preserve"> (Gisslinger 2023 primary). LOCF 72.6% vs 47.3% is the published analogue of the ~70% graph.</w:t>
+              <w:t>47.3% (35/74)</w:t>
+            </w:r>
+          </w:p>
+        </w:tc>
+        <w:tc>
+          <w:tcPr>
+            <w:tcW w:type="dxa" w:w="1930"/>
+          </w:tcPr>
+          <w:p>
+            <w:r>
+              <w:t>p=0.001</w:t>
+            </w:r>
+          </w:p>
+        </w:tc>
+        <w:tc>
+          <w:tcPr>
+            <w:tcW w:type="dxa" w:w="1930"/>
+          </w:tcPr>
+          <w:p>
+            <w:r>
+              <w:t>Analogue of the graph</w:t>
             </w:r>
           </w:p>
         </w:tc>
@@ -4071,90 +4693,10 @@
         <w:rPr>
           <w:b/>
         </w:rPr>
-        <w:t>Do not</w:t>
-      </w:r>
-      <w:r>
-        <w:t xml:space="preserve"> collapse those four rows into “about 80% respond.” The brochure may print 84.3% </w:t>
-      </w:r>
-      <w:r>
-        <w:rPr>
-          <w:b/>
-        </w:rPr>
-        <w:t>with its footnote</w:t>
-      </w:r>
-      <w:r>
-        <w:t>; you must say the footnote.</w:t>
-      </w:r>
-      <w:r/>
-    </w:p>
-    <w:p>
-      <w:r/>
-      <w:r>
-        <w:rPr>
-          <w:b/>
-        </w:rPr>
-        <w:t>Brochure callout, do not mix with EFS:</w:t>
-      </w:r>
-      <w:r>
-        <w:t xml:space="preserve"> major thromboembolic events </w:t>
-      </w:r>
-      <w:r>
-        <w:rPr>
-          <w:b/>
-        </w:rPr>
-        <w:t>3% (4/127)</w:t>
-      </w:r>
-      <w:r>
-        <w:t xml:space="preserve"> at 36 months. That is </w:t>
-      </w:r>
-      <w:r>
-        <w:rPr>
-          <w:b/>
-        </w:rPr>
-        <w:t>not</w:t>
-      </w:r>
-      <w:r>
-        <w:t xml:space="preserve"> the EFS first-event count of 5/95.</w:t>
-      </w:r>
-      <w:r/>
-    </w:p>
-    <w:p>
-      <w:r/>
-      <w:r>
-        <w:rPr>
-          <w:b/>
-        </w:rPr>
         <w:t>Titration honesty (HK PI):</w:t>
       </w:r>
       <w:r>
-        <w:t xml:space="preserve"> mean titration ~3.7 months (ropeg) vs ~2.6 months (hydroxycarbamide). HU may be preferred when </w:t>
-      </w:r>
-      <w:r>
-        <w:rPr>
-          <w:b/>
-        </w:rPr>
-        <w:t>early</w:t>
-      </w:r>
-      <w:r>
-        <w:t xml:space="preserve"> count reduction is needed to prevent thrombosis/bleeding. This is a clinical nuance, not an anti-product line. It is also why the graph’s month-12 dots sit </w:t>
-      </w:r>
-      <w:r>
-        <w:rPr>
-          <w:b/>
-        </w:rPr>
-        <w:t>above</w:t>
-      </w:r>
-      <w:r>
-        <w:t xml:space="preserve"> HU and </w:t>
-      </w:r>
-      <w:r>
-        <w:rPr>
-          <w:b/>
-        </w:rPr>
-        <w:t>below</w:t>
-      </w:r>
-      <w:r>
-        <w:t xml:space="preserve"> the PI 43.1% story at the same calendar time — different analysis, same pharmacology.</w:t>
+        <w:t xml:space="preserve"> ~3.7 vs ~2.6 months. Same pharmacology as the graph’s month-12 HU lead.</w:t>
       </w:r>
       <w:r/>
     </w:p>
@@ -4171,7 +4713,7 @@
         <w:pStyle w:val="Heading3"/>
       </w:pPr>
       <w:r>
-        <w:t>8b. Brochure — JAK2 V617F allele burden (if this page is in the room)</w:t>
+        <w:t>8b. Brochure JAK2 page — core when handed over</w:t>
       </w:r>
       <w:r/>
     </w:p>
@@ -8169,7 +8711,7 @@
         <w:color w:val="E07A2F"/>
         <w:sz w:val="18"/>
       </w:rPr>
-      <w:t>DRAFT — NOT FOR FIELD USE  |  BESREMi physician product training (HK) v2  |  26 Aug 2026</w:t>
+      <w:t>DRAFT — NOT FOR FIELD USE  |  BESREMi physician training v3  |  brochure-first  |  26 Aug 2026</w:t>
     </w:r>
   </w:p>
 </w:hdr>

</xml_diff>